<commit_message>
docs: updated requirements file
</commit_message>
<xml_diff>
--- a/docs/requirement.docx
+++ b/docs/requirement.docx
@@ -581,7 +581,10 @@
           </w:tcPr>
           <w:p>
             <w:r>
-              <w:t xml:space="preserve">Login button </w:t>
+              <w:t>Sign in</w:t>
+            </w:r>
+            <w:r>
+              <w:t xml:space="preserve"> button </w:t>
             </w:r>
           </w:p>
         </w:tc>
@@ -616,27 +619,42 @@
           </w:tcPr>
           <w:p>
             <w:r>
-              <w:t>Register button</w:t>
-            </w:r>
-          </w:p>
-        </w:tc>
-        <w:tc>
-          <w:tcPr>
-            <w:tcW w:w="3117" w:type="dxa"/>
-          </w:tcPr>
-          <w:p>
-            <w:r>
-              <w:t>The button should use the same styling as the login button.</w:t>
-            </w:r>
-          </w:p>
-        </w:tc>
-        <w:tc>
-          <w:tcPr>
-            <w:tcW w:w="3117" w:type="dxa"/>
-          </w:tcPr>
-          <w:p>
-            <w:r>
-              <w:t>The button should clearly be visible, but not standout more than the login button</w:t>
+              <w:t>Sign up</w:t>
+            </w:r>
+            <w:r>
+              <w:t xml:space="preserve"> button</w:t>
+            </w:r>
+          </w:p>
+        </w:tc>
+        <w:tc>
+          <w:tcPr>
+            <w:tcW w:w="3117" w:type="dxa"/>
+          </w:tcPr>
+          <w:p>
+            <w:r>
+              <w:t xml:space="preserve">The button should use the same styling as the </w:t>
+            </w:r>
+            <w:r>
+              <w:t>sign in</w:t>
+            </w:r>
+            <w:r>
+              <w:t xml:space="preserve"> button.</w:t>
+            </w:r>
+          </w:p>
+        </w:tc>
+        <w:tc>
+          <w:tcPr>
+            <w:tcW w:w="3117" w:type="dxa"/>
+          </w:tcPr>
+          <w:p>
+            <w:r>
+              <w:t xml:space="preserve">The button should clearly be visible, but not standout more than the </w:t>
+            </w:r>
+            <w:r>
+              <w:t>sign in</w:t>
+            </w:r>
+            <w:r>
+              <w:t xml:space="preserve"> button</w:t>
             </w:r>
           </w:p>
         </w:tc>
@@ -1409,6 +1427,7 @@
   <w:style w:type="character" w:default="1" w:styleId="DefaultParagraphFont">
     <w:name w:val="Default Paragraph Font"/>
     <w:uiPriority w:val="1"/>
+    <w:semiHidden/>
     <w:unhideWhenUsed/>
   </w:style>
   <w:style w:type="table" w:default="1" w:styleId="TableNormal">

</xml_diff>